<commit_message>
my part of report
</commit_message>
<xml_diff>
--- a/report1305.docx
+++ b/report1305.docx
@@ -36,16 +36,80 @@
         <w:t>Dynamic Memory Memetic Algorithm</w:t>
       </w:r>
     </w:p>
+    <w:p>
+      <w:r>
+        <w:t xml:space="preserve">We began to code a memetic algorithm inspired by Dynamic Memory Memetic Algorithm used to solve </w:t>
+      </w:r>
+      <w:r>
+        <w:t>vehicle routing problem with pickup and delivery</w:t>
+      </w:r>
+      <w:r>
+        <w:t xml:space="preserve"> presented in paper [1].</w:t>
+      </w:r>
+    </w:p>
+    <w:p>
+      <w:r>
+        <w:t xml:space="preserve">Memetic algorithm is an extension of evolutionary </w:t>
+      </w:r>
+      <w:r>
+        <w:t>algorithm;</w:t>
+      </w:r>
+      <w:r>
+        <w:t xml:space="preserve"> it uses local search </w:t>
+      </w:r>
+      <w:r>
+        <w:t xml:space="preserve">to speed up the </w:t>
+      </w:r>
+      <w:r>
+        <w:t>process of finding the optimal solution.</w:t>
+      </w:r>
+    </w:p>
+    <w:p>
+      <w:r>
+        <w:t xml:space="preserve">The “Dynamic Memory” is a set of feasible solutions used to update the solutions in the population. </w:t>
+      </w:r>
+    </w:p>
+    <w:p>
+      <w:pPr>
+        <w:pStyle w:val="Heading2"/>
+      </w:pPr>
+      <w:r>
+        <w:t>Neural Network</w:t>
+      </w:r>
+    </w:p>
     <w:p/>
     <w:p>
       <w:pPr>
         <w:pStyle w:val="Heading2"/>
       </w:pPr>
       <w:r>
-        <w:t>Neural Network</w:t>
+        <w:t>Future Work</w:t>
       </w:r>
     </w:p>
-    <w:p/>
+    <w:p>
+      <w:r>
+        <w:t>We aim to compare the algorithms presented above to other heuristic algorithms to determine the most effective one.</w:t>
+      </w:r>
+    </w:p>
+    <w:p>
+      <w:pPr>
+        <w:pStyle w:val="Heading2"/>
+      </w:pPr>
+      <w:r>
+        <w:t>Bibliography</w:t>
+      </w:r>
+    </w:p>
+    <w:p>
+      <w:r>
+        <w:t>[1]</w:t>
+      </w:r>
+      <w:r>
+        <w:t xml:space="preserve"> - </w:t>
+      </w:r>
+      <w:r>
+        <w:t>https://ieeexplore.ieee.org/abstract/document/9194245</w:t>
+      </w:r>
+    </w:p>
     <w:sectPr>
       <w:pgSz w:w="11906" w:h="16838"/>
       <w:pgMar w:top="1417" w:right="1417" w:bottom="1417" w:left="1417" w:header="708" w:footer="708" w:gutter="0"/>
@@ -657,7 +721,6 @@
   <w:style w:type="character" w:default="1" w:styleId="DefaultParagraphFont">
     <w:name w:val="Default Paragraph Font"/>
     <w:uiPriority w:val="1"/>
-    <w:semiHidden/>
     <w:unhideWhenUsed/>
   </w:style>
   <w:style w:type="table" w:default="1" w:styleId="TableNormal">

</xml_diff>